<commit_message>
Initial commit - updated resume
</commit_message>
<xml_diff>
--- a/public/Resume.docx
+++ b/public/Resume.docx
@@ -273,7 +273,7 @@
       </w:pPr>
       <w:r>
         <w:pict w14:anchorId="5749CD86">
-          <v:shape id="Image 2" o:spid="_x0000_i1026" type="#_x0000_t75" style="width:11.4pt;height:11.4pt;visibility:visible;mso-wrap-style:square">
+          <v:shape id="Image 2" o:spid="_x0000_i1040" type="#_x0000_t75" style="width:11.4pt;height:11.4pt;visibility:visible;mso-wrap-style:square">
             <v:imagedata r:id="rId7" o:title=""/>
             <o:lock v:ext="edit" aspectratio="f"/>
           </v:shape>
@@ -364,6 +364,7 @@
           <w:tab w:val="left" w:pos="10639"/>
         </w:tabs>
         <w:ind w:left="84"/>
+        <w:jc w:val="both"/>
         <w:rPr>
           <w:rFonts w:ascii="Cambria"/>
           <w:b/>
@@ -494,6 +495,7 @@
           <w:tab w:val="left" w:pos="10639"/>
         </w:tabs>
         <w:ind w:left="84"/>
+        <w:jc w:val="both"/>
       </w:pPr>
       <w:r>
         <w:t xml:space="preserve">I am a </w:t>
@@ -704,6 +706,7 @@
           <w:tab w:val="left" w:pos="10639"/>
         </w:tabs>
         <w:ind w:left="84"/>
+        <w:jc w:val="both"/>
         <w:rPr>
           <w:rFonts w:ascii="Cambria"/>
           <w:b/>
@@ -768,6 +771,7 @@
         </w:tabs>
         <w:spacing w:before="160"/>
         <w:ind w:left="265" w:hanging="181"/>
+        <w:jc w:val="both"/>
         <w:rPr>
           <w:sz w:val="20"/>
         </w:rPr>
@@ -891,6 +895,7 @@
         </w:tabs>
         <w:spacing w:before="35"/>
         <w:ind w:left="265" w:hanging="181"/>
+        <w:jc w:val="both"/>
         <w:rPr>
           <w:sz w:val="20"/>
         </w:rPr>
@@ -1017,6 +1022,7 @@
         </w:tabs>
         <w:spacing w:before="34"/>
         <w:ind w:left="265" w:hanging="181"/>
+        <w:jc w:val="both"/>
         <w:rPr>
           <w:sz w:val="20"/>
         </w:rPr>
@@ -1153,6 +1159,7 @@
         </w:tabs>
         <w:spacing w:before="34"/>
         <w:ind w:left="265" w:hanging="181"/>
+        <w:jc w:val="both"/>
         <w:rPr>
           <w:sz w:val="20"/>
         </w:rPr>
@@ -1302,6 +1309,7 @@
         <w:tabs>
           <w:tab w:val="left" w:pos="10639"/>
         </w:tabs>
+        <w:jc w:val="both"/>
         <w:rPr>
           <w:rFonts w:ascii="Cambria"/>
           <w:b/>
@@ -1354,6 +1362,7 @@
         </w:tabs>
         <w:spacing w:before="75"/>
         <w:ind w:hanging="230"/>
+        <w:jc w:val="both"/>
         <w:rPr>
           <w:sz w:val="18"/>
         </w:rPr>
@@ -1483,6 +1492,7 @@
         </w:tabs>
         <w:spacing w:before="13"/>
         <w:ind w:left="314"/>
+        <w:jc w:val="both"/>
         <w:rPr>
           <w:sz w:val="18"/>
         </w:rPr>
@@ -1551,6 +1561,7 @@
         </w:tabs>
         <w:spacing w:before="52" w:line="259" w:lineRule="auto"/>
         <w:ind w:right="1117"/>
+        <w:jc w:val="both"/>
         <w:rPr>
           <w:sz w:val="20"/>
         </w:rPr>
@@ -1721,6 +1732,7 @@
         </w:tabs>
         <w:spacing w:before="37"/>
         <w:ind w:left="338" w:hanging="124"/>
+        <w:jc w:val="both"/>
         <w:rPr>
           <w:sz w:val="20"/>
         </w:rPr>
@@ -1867,6 +1879,7 @@
           <w:tab w:val="left" w:pos="348"/>
         </w:tabs>
         <w:ind w:left="348" w:hanging="134"/>
+        <w:jc w:val="both"/>
         <w:rPr>
           <w:spacing w:val="-2"/>
           <w:sz w:val="20"/>
@@ -2060,6 +2073,7 @@
         </w:tabs>
         <w:spacing w:before="75"/>
         <w:ind w:hanging="230"/>
+        <w:jc w:val="both"/>
         <w:rPr>
           <w:sz w:val="18"/>
         </w:rPr>
@@ -2189,6 +2203,7 @@
         </w:tabs>
         <w:spacing w:before="13"/>
         <w:ind w:left="314"/>
+        <w:jc w:val="both"/>
         <w:rPr>
           <w:sz w:val="18"/>
         </w:rPr>
@@ -2287,6 +2302,7 @@
         </w:tabs>
         <w:spacing w:before="52" w:line="259" w:lineRule="auto"/>
         <w:ind w:right="1117"/>
+        <w:jc w:val="both"/>
         <w:rPr>
           <w:sz w:val="20"/>
         </w:rPr>
@@ -2485,6 +2501,7 @@
         </w:tabs>
         <w:spacing w:before="37"/>
         <w:ind w:left="338" w:hanging="124"/>
+        <w:jc w:val="both"/>
         <w:rPr>
           <w:sz w:val="20"/>
         </w:rPr>
@@ -2690,6 +2707,7 @@
           <w:tab w:val="left" w:pos="348"/>
         </w:tabs>
         <w:ind w:left="348" w:hanging="134"/>
+        <w:jc w:val="both"/>
         <w:rPr>
           <w:sz w:val="20"/>
         </w:rPr>
@@ -2889,6 +2907,7 @@
           <w:tab w:val="left" w:pos="10639"/>
         </w:tabs>
         <w:ind w:left="84"/>
+        <w:jc w:val="both"/>
         <w:rPr>
           <w:rFonts w:ascii="Cambria"/>
           <w:b/>
@@ -2969,71 +2988,44 @@
         </w:numPr>
         <w:tabs>
           <w:tab w:val="left" w:pos="314"/>
-          <w:tab w:val="left" w:pos="5548"/>
+          <w:tab w:val="left" w:pos="6086"/>
         </w:tabs>
-        <w:spacing w:before="98"/>
         <w:ind w:hanging="230"/>
+        <w:jc w:val="both"/>
         <w:rPr>
           <w:u w:val="none"/>
         </w:rPr>
       </w:pPr>
-      <w:r>
-        <w:rPr>
-          <w:spacing w:val="-4"/>
-          <w:u w:val="none"/>
-        </w:rPr>
-        <w:t>Music</w:t>
-      </w:r>
-      <w:r>
-        <w:rPr>
-          <w:spacing w:val="-7"/>
-          <w:u w:val="none"/>
-        </w:rPr>
-        <w:t xml:space="preserve"> </w:t>
-      </w:r>
-      <w:r>
-        <w:rPr>
-          <w:spacing w:val="-4"/>
-          <w:u w:val="none"/>
-        </w:rPr>
-        <w:t>Streaming</w:t>
-      </w:r>
       <w:r>
         <w:rPr>
           <w:spacing w:val="-6"/>
           <w:u w:val="none"/>
         </w:rPr>
-        <w:t xml:space="preserve"> </w:t>
-      </w:r>
-      <w:r>
-        <w:rPr>
-          <w:spacing w:val="-4"/>
+        <w:t>Police Verification System</w:t>
+      </w:r>
+      <w:r>
+        <w:rPr>
           <w:u w:val="none"/>
         </w:rPr>
-        <w:t>Software</w:t>
-      </w:r>
-      <w:r>
-        <w:rPr>
-          <w:u w:val="none"/>
-        </w:rPr>
         <w:tab/>
       </w:r>
       <w:r>
         <w:rPr>
           <w:color w:val="1F487C"/>
-          <w:spacing w:val="-6"/>
+          <w:spacing w:val="-2"/>
           <w:u w:color="1F487C"/>
         </w:rPr>
-        <w:t>https://github.com/UtsavShelke/Sword-Music-App.git</w:t>
+        <w:t>https://github.com/UtsavShelke/FuzzRecords.git</w:t>
       </w:r>
     </w:p>
     <w:p>
       <w:pPr>
         <w:tabs>
-          <w:tab w:val="left" w:pos="8665"/>
+          <w:tab w:val="left" w:pos="8804"/>
         </w:tabs>
         <w:spacing w:before="18"/>
         <w:ind w:left="314"/>
+        <w:jc w:val="both"/>
         <w:rPr>
           <w:sz w:val="18"/>
         </w:rPr>
@@ -3049,7 +3041,7 @@
       <w:r>
         <w:rPr>
           <w:rFonts w:ascii="Times New Roman" w:hAnsi="Times New Roman"/>
-          <w:spacing w:val="31"/>
+          <w:spacing w:val="38"/>
           <w:sz w:val="20"/>
           <w:szCs w:val="24"/>
         </w:rPr>
@@ -3061,12 +3053,13 @@
           <w:sz w:val="20"/>
           <w:szCs w:val="24"/>
         </w:rPr>
-        <w:t>PHP,</w:t>
+        <w:t>React,</w:t>
       </w:r>
       <w:r>
         <w:rPr>
           <w:rFonts w:ascii="Times New Roman" w:hAnsi="Times New Roman"/>
-          <w:spacing w:val="68"/>
+          <w:spacing w:val="60"/>
+          <w:w w:val="150"/>
           <w:sz w:val="20"/>
           <w:szCs w:val="24"/>
         </w:rPr>
@@ -3078,59 +3071,68 @@
           <w:sz w:val="20"/>
           <w:szCs w:val="24"/>
         </w:rPr>
-        <w:t>MySQL,</w:t>
+        <w:t>EJS</w:t>
       </w:r>
       <w:r>
         <w:rPr>
           <w:rFonts w:ascii="Times New Roman" w:hAnsi="Times New Roman"/>
-          <w:spacing w:val="68"/>
           <w:sz w:val="20"/>
           <w:szCs w:val="24"/>
         </w:rPr>
-        <w:t xml:space="preserve"> </w:t>
+        <w:t>,</w:t>
       </w:r>
       <w:r>
         <w:rPr>
           <w:rFonts w:ascii="Times New Roman" w:hAnsi="Times New Roman"/>
+          <w:spacing w:val="56"/>
+          <w:w w:val="150"/>
           <w:sz w:val="20"/>
           <w:szCs w:val="24"/>
         </w:rPr>
-        <w:t>HTML,</w:t>
+        <w:t xml:space="preserve"> </w:t>
       </w:r>
       <w:r>
         <w:rPr>
           <w:rFonts w:ascii="Times New Roman" w:hAnsi="Times New Roman"/>
-          <w:spacing w:val="69"/>
           <w:sz w:val="20"/>
           <w:szCs w:val="24"/>
         </w:rPr>
-        <w:t xml:space="preserve"> </w:t>
+        <w:t>Frontend</w:t>
       </w:r>
       <w:r>
         <w:rPr>
           <w:rFonts w:ascii="Times New Roman" w:hAnsi="Times New Roman"/>
+          <w:spacing w:val="79"/>
           <w:sz w:val="20"/>
           <w:szCs w:val="24"/>
         </w:rPr>
-        <w:t>CSS,</w:t>
+        <w:t xml:space="preserve"> </w:t>
       </w:r>
       <w:r>
         <w:rPr>
           <w:rFonts w:ascii="Times New Roman" w:hAnsi="Times New Roman"/>
-          <w:spacing w:val="68"/>
           <w:sz w:val="20"/>
           <w:szCs w:val="24"/>
         </w:rPr>
-        <w:t xml:space="preserve"> </w:t>
+        <w:t>Design,</w:t>
       </w:r>
       <w:r>
         <w:rPr>
           <w:rFonts w:ascii="Times New Roman" w:hAnsi="Times New Roman"/>
-          <w:spacing w:val="-2"/>
+          <w:spacing w:val="-3"/>
           <w:sz w:val="20"/>
           <w:szCs w:val="24"/>
         </w:rPr>
-        <w:t>JavaScript</w:t>
+        <w:t xml:space="preserve"> </w:t>
+      </w:r>
+      <w:r>
+        <w:rPr>
+          <w:rFonts w:ascii="Times New Roman" w:hAnsi="Times New Roman"/>
+          <w:spacing w:val="-2"/>
+          <w:sz w:val="20"/>
+          <w:szCs w:val="24"/>
+        </w:rPr>
+        <w:t>MongoDB</w:t>
       </w:r>
       <w:r>
         <w:rPr>
@@ -3152,60 +3154,7 @@
         <w:rPr>
           <w:sz w:val="18"/>
         </w:rPr>
-        <w:t>Jan</w:t>
-      </w:r>
-      <w:r>
-        <w:rPr>
-          <w:spacing w:val="-4"/>
-          <w:sz w:val="18"/>
-        </w:rPr>
-        <w:t xml:space="preserve"> </w:t>
-      </w:r>
-      <w:r>
-        <w:rPr>
-          <w:sz w:val="18"/>
-        </w:rPr>
-        <w:t>2023</w:t>
-      </w:r>
-      <w:r>
-        <w:rPr>
-          <w:spacing w:val="5"/>
-          <w:sz w:val="18"/>
-        </w:rPr>
-        <w:t xml:space="preserve"> </w:t>
-      </w:r>
-      <w:r>
-        <w:rPr>
-          <w:sz w:val="18"/>
-        </w:rPr>
-        <w:t>–</w:t>
-      </w:r>
-      <w:r>
-        <w:rPr>
-          <w:spacing w:val="-4"/>
-          <w:sz w:val="18"/>
-        </w:rPr>
-        <w:t xml:space="preserve"> </w:t>
-      </w:r>
-      <w:r>
-        <w:rPr>
-          <w:sz w:val="18"/>
-        </w:rPr>
-        <w:t>Apr</w:t>
-      </w:r>
-      <w:r>
-        <w:rPr>
-          <w:spacing w:val="6"/>
-          <w:sz w:val="18"/>
-        </w:rPr>
-        <w:t xml:space="preserve"> </w:t>
-      </w:r>
-      <w:r>
-        <w:rPr>
-          <w:spacing w:val="-4"/>
-          <w:sz w:val="18"/>
-        </w:rPr>
-        <w:t>2023</w:t>
+        <w:t>Jan 2026 – Apr 2026</w:t>
       </w:r>
     </w:p>
     <w:p>
@@ -3218,33 +3167,77 @@
         <w:tabs>
           <w:tab w:val="left" w:pos="348"/>
         </w:tabs>
-        <w:spacing w:before="54"/>
+        <w:spacing w:before="49"/>
         <w:ind w:left="348" w:hanging="134"/>
+        <w:jc w:val="both"/>
         <w:rPr>
           <w:sz w:val="20"/>
         </w:rPr>
       </w:pPr>
       <w:r>
         <w:rPr>
+          <w:spacing w:val="-2"/>
+          <w:sz w:val="20"/>
+        </w:rPr>
+        <w:t>Developed a</w:t>
+      </w:r>
+      <w:r>
+        <w:rPr>
           <w:spacing w:val="-4"/>
           <w:sz w:val="20"/>
         </w:rPr>
-        <w:t>Developed</w:t>
-      </w:r>
-      <w:r>
-        <w:rPr>
-          <w:spacing w:val="-3"/>
-          <w:sz w:val="20"/>
-        </w:rPr>
-        <w:t xml:space="preserve"> </w:t>
-      </w:r>
-      <w:r>
-        <w:rPr>
-          <w:spacing w:val="-4"/>
-          <w:sz w:val="20"/>
-        </w:rPr>
-        <w:t>a</w:t>
-      </w:r>
+        <w:t xml:space="preserve"> </w:t>
+      </w:r>
+      <w:r>
+        <w:rPr>
+          <w:spacing w:val="-2"/>
+          <w:sz w:val="20"/>
+        </w:rPr>
+        <w:t>frontend</w:t>
+      </w:r>
+      <w:r>
+        <w:rPr>
+          <w:spacing w:val="2"/>
+          <w:sz w:val="20"/>
+        </w:rPr>
+        <w:t xml:space="preserve"> </w:t>
+      </w:r>
+      <w:r>
+        <w:rPr>
+          <w:spacing w:val="-2"/>
+          <w:sz w:val="20"/>
+        </w:rPr>
+        <w:t>interface</w:t>
+      </w:r>
+      <w:r>
+        <w:rPr>
+          <w:spacing w:val="-5"/>
+          <w:sz w:val="20"/>
+        </w:rPr>
+        <w:t xml:space="preserve"> </w:t>
+      </w:r>
+      <w:r>
+        <w:rPr>
+          <w:spacing w:val="-2"/>
+          <w:sz w:val="20"/>
+        </w:rPr>
+        <w:t>for</w:t>
+      </w:r>
+      <w:r>
+        <w:rPr>
+          <w:sz w:val="20"/>
+        </w:rPr>
+        <w:t xml:space="preserve"> </w:t>
+      </w:r>
+      <w:proofErr w:type="gramStart"/>
+      <w:r>
+        <w:rPr>
+          <w:spacing w:val="-2"/>
+          <w:sz w:val="20"/>
+        </w:rPr>
+        <w:t>an</w:t>
+      </w:r>
+      <w:proofErr w:type="gramEnd"/>
       <w:r>
         <w:rPr>
           <w:spacing w:val="3"/>
@@ -3254,94 +3247,81 @@
       </w:r>
       <w:r>
         <w:rPr>
-          <w:spacing w:val="-4"/>
-          <w:sz w:val="20"/>
-        </w:rPr>
-        <w:t>web-based</w:t>
-      </w:r>
-      <w:r>
-        <w:rPr>
-          <w:spacing w:val="3"/>
-          <w:sz w:val="20"/>
-        </w:rPr>
-        <w:t xml:space="preserve"> </w:t>
-      </w:r>
-      <w:r>
-        <w:rPr>
-          <w:spacing w:val="-4"/>
-          <w:sz w:val="20"/>
-        </w:rPr>
-        <w:t>system</w:t>
-      </w:r>
-      <w:r>
-        <w:rPr>
-          <w:spacing w:val="-2"/>
-          <w:sz w:val="20"/>
-        </w:rPr>
-        <w:t xml:space="preserve"> </w:t>
-      </w:r>
-      <w:r>
-        <w:rPr>
-          <w:spacing w:val="-4"/>
-          <w:sz w:val="20"/>
-        </w:rPr>
-        <w:t>for</w:t>
-      </w:r>
-      <w:r>
-        <w:rPr>
-          <w:spacing w:val="-3"/>
-          <w:sz w:val="20"/>
-        </w:rPr>
-        <w:t xml:space="preserve"> </w:t>
-      </w:r>
-      <w:r>
-        <w:rPr>
-          <w:spacing w:val="-4"/>
-          <w:sz w:val="20"/>
-        </w:rPr>
-        <w:t>streaming</w:t>
-      </w:r>
-      <w:r>
-        <w:rPr>
-          <w:spacing w:val="7"/>
-          <w:sz w:val="20"/>
-        </w:rPr>
-        <w:t xml:space="preserve"> </w:t>
-      </w:r>
-      <w:r>
-        <w:rPr>
-          <w:spacing w:val="-4"/>
+          <w:spacing w:val="-2"/>
+          <w:sz w:val="20"/>
+        </w:rPr>
+        <w:t>Police ID verification</w:t>
+      </w:r>
+      <w:r>
+        <w:rPr>
+          <w:spacing w:val="-5"/>
+          <w:sz w:val="20"/>
+        </w:rPr>
+        <w:t xml:space="preserve"> </w:t>
+      </w:r>
+      <w:r>
+        <w:rPr>
+          <w:spacing w:val="-2"/>
+          <w:sz w:val="20"/>
+        </w:rPr>
+        <w:t>using</w:t>
+      </w:r>
+      <w:r>
+        <w:rPr>
+          <w:sz w:val="20"/>
+        </w:rPr>
+        <w:t xml:space="preserve"> </w:t>
+      </w:r>
+      <w:r>
+        <w:rPr>
+          <w:spacing w:val="-2"/>
+          <w:sz w:val="20"/>
+        </w:rPr>
+        <w:t>React</w:t>
+      </w:r>
+      <w:r>
+        <w:rPr>
+          <w:spacing w:val="4"/>
+          <w:sz w:val="20"/>
+        </w:rPr>
+        <w:t xml:space="preserve"> </w:t>
+      </w:r>
+      <w:r>
+        <w:rPr>
+          <w:spacing w:val="-2"/>
           <w:sz w:val="20"/>
         </w:rPr>
         <w:t>and</w:t>
       </w:r>
       <w:r>
         <w:rPr>
-          <w:spacing w:val="3"/>
-          <w:sz w:val="20"/>
-        </w:rPr>
-        <w:t xml:space="preserve"> </w:t>
-      </w:r>
-      <w:r>
-        <w:rPr>
-          <w:spacing w:val="-4"/>
-          <w:sz w:val="20"/>
-        </w:rPr>
-        <w:t>downloading</w:t>
-      </w:r>
-      <w:r>
-        <w:rPr>
-          <w:spacing w:val="2"/>
-          <w:sz w:val="20"/>
-        </w:rPr>
-        <w:t xml:space="preserve"> </w:t>
-      </w:r>
-      <w:r>
-        <w:rPr>
-          <w:spacing w:val="-4"/>
-          <w:sz w:val="20"/>
-        </w:rPr>
-        <w:t>music.</w:t>
+          <w:spacing w:val="1"/>
+          <w:sz w:val="20"/>
+        </w:rPr>
+        <w:t xml:space="preserve"> </w:t>
+      </w:r>
+      <w:r>
+        <w:rPr>
+          <w:spacing w:val="-2"/>
+          <w:sz w:val="20"/>
+        </w:rPr>
+        <w:t xml:space="preserve">Embedded </w:t>
+      </w:r>
+      <w:proofErr w:type="spellStart"/>
+      <w:r>
+        <w:rPr>
+          <w:spacing w:val="-2"/>
+          <w:sz w:val="20"/>
+        </w:rPr>
+        <w:t>Javascript</w:t>
+      </w:r>
+      <w:proofErr w:type="spellEnd"/>
+      <w:r>
+        <w:rPr>
+          <w:spacing w:val="-2"/>
+          <w:sz w:val="20"/>
+        </w:rPr>
+        <w:t>.</w:t>
       </w:r>
     </w:p>
     <w:p>
@@ -3355,142 +3335,928 @@
           <w:tab w:val="left" w:pos="348"/>
         </w:tabs>
         <w:ind w:left="348" w:hanging="134"/>
+        <w:jc w:val="both"/>
         <w:rPr>
           <w:sz w:val="20"/>
         </w:rPr>
       </w:pPr>
       <w:r>
         <w:rPr>
-          <w:spacing w:val="-2"/>
-          <w:sz w:val="20"/>
-        </w:rPr>
-        <w:t>Better</w:t>
-      </w:r>
-      <w:r>
-        <w:rPr>
-          <w:spacing w:val="-11"/>
-          <w:sz w:val="20"/>
-        </w:rPr>
-        <w:t xml:space="preserve"> </w:t>
-      </w:r>
-      <w:r>
-        <w:rPr>
-          <w:spacing w:val="-2"/>
+          <w:spacing w:val="-4"/>
+          <w:sz w:val="20"/>
+        </w:rPr>
+        <w:t>Implemented</w:t>
+      </w:r>
+      <w:r>
+        <w:rPr>
+          <w:spacing w:val="-3"/>
+          <w:sz w:val="20"/>
+        </w:rPr>
+        <w:t xml:space="preserve"> </w:t>
+      </w:r>
+      <w:r>
+        <w:rPr>
+          <w:spacing w:val="-4"/>
+          <w:sz w:val="20"/>
+        </w:rPr>
+        <w:t>interactive</w:t>
+      </w:r>
+      <w:r>
+        <w:rPr>
+          <w:spacing w:val="1"/>
+          <w:sz w:val="20"/>
+        </w:rPr>
+        <w:t xml:space="preserve"> </w:t>
+      </w:r>
+      <w:r>
+        <w:rPr>
+          <w:spacing w:val="-4"/>
+          <w:sz w:val="20"/>
+        </w:rPr>
+        <w:t>forms and</w:t>
+      </w:r>
+      <w:r>
+        <w:rPr>
+          <w:spacing w:val="1"/>
+          <w:sz w:val="20"/>
+        </w:rPr>
+        <w:t xml:space="preserve"> </w:t>
+      </w:r>
+      <w:r>
+        <w:rPr>
+          <w:spacing w:val="-4"/>
+          <w:sz w:val="20"/>
+        </w:rPr>
+        <w:t>dashboards</w:t>
+      </w:r>
+      <w:r>
+        <w:rPr>
+          <w:spacing w:val="1"/>
+          <w:sz w:val="20"/>
+        </w:rPr>
+        <w:t xml:space="preserve"> </w:t>
+      </w:r>
+      <w:r>
+        <w:rPr>
+          <w:spacing w:val="-4"/>
+          <w:sz w:val="20"/>
+        </w:rPr>
+        <w:t>to</w:t>
+      </w:r>
+      <w:r>
+        <w:rPr>
+          <w:spacing w:val="-2"/>
+          <w:sz w:val="20"/>
+        </w:rPr>
+        <w:t xml:space="preserve"> </w:t>
+      </w:r>
+      <w:r>
+        <w:rPr>
+          <w:spacing w:val="-4"/>
+          <w:sz w:val="20"/>
+        </w:rPr>
+        <w:t>verify reports quickly</w:t>
+      </w:r>
+      <w:r>
+        <w:rPr>
+          <w:spacing w:val="-4"/>
+          <w:sz w:val="20"/>
+        </w:rPr>
+        <w:t>.</w:t>
+      </w:r>
+    </w:p>
+    <w:p>
+      <w:pPr>
+        <w:pStyle w:val="ListParagraph"/>
+        <w:numPr>
+          <w:ilvl w:val="1"/>
+          <w:numId w:val="1"/>
+        </w:numPr>
+        <w:tabs>
+          <w:tab w:val="left" w:pos="348"/>
+        </w:tabs>
+        <w:spacing w:before="61"/>
+        <w:ind w:left="348" w:hanging="134"/>
+        <w:jc w:val="both"/>
+        <w:rPr>
+          <w:sz w:val="20"/>
+        </w:rPr>
+      </w:pPr>
+      <w:r>
+        <w:rPr>
+          <w:spacing w:val="-4"/>
+          <w:sz w:val="20"/>
+        </w:rPr>
+        <w:t>Focused on</w:t>
+      </w:r>
+      <w:r>
+        <w:rPr>
+          <w:spacing w:val="-2"/>
+          <w:sz w:val="20"/>
+        </w:rPr>
+        <w:t xml:space="preserve"> </w:t>
+      </w:r>
+      <w:r>
+        <w:rPr>
+          <w:spacing w:val="-4"/>
+          <w:sz w:val="20"/>
+        </w:rPr>
+        <w:t>responsive design</w:t>
+      </w:r>
+      <w:r>
+        <w:rPr>
+          <w:spacing w:val="-2"/>
+          <w:sz w:val="20"/>
+        </w:rPr>
+        <w:t xml:space="preserve"> </w:t>
+      </w:r>
+      <w:r>
+        <w:rPr>
+          <w:spacing w:val="-4"/>
+          <w:sz w:val="20"/>
+        </w:rPr>
+        <w:t>for seamless</w:t>
+      </w:r>
+      <w:r>
+        <w:rPr>
+          <w:spacing w:val="2"/>
+          <w:sz w:val="20"/>
+        </w:rPr>
+        <w:t xml:space="preserve"> </w:t>
+      </w:r>
+      <w:r>
+        <w:rPr>
+          <w:spacing w:val="-4"/>
+          <w:sz w:val="20"/>
+        </w:rPr>
+        <w:t>usage across</w:t>
+      </w:r>
+      <w:r>
+        <w:rPr>
+          <w:spacing w:val="2"/>
+          <w:sz w:val="20"/>
+        </w:rPr>
+        <w:t xml:space="preserve"> </w:t>
+      </w:r>
+      <w:r>
+        <w:rPr>
+          <w:spacing w:val="-4"/>
+          <w:sz w:val="20"/>
+        </w:rPr>
+        <w:t>devices</w:t>
+      </w:r>
+      <w:r>
+        <w:rPr>
+          <w:spacing w:val="-4"/>
+          <w:sz w:val="20"/>
+        </w:rPr>
+        <w:t>.</w:t>
+      </w:r>
+    </w:p>
+    <w:p>
+      <w:pPr>
+        <w:pStyle w:val="Heading1"/>
+        <w:numPr>
+          <w:ilvl w:val="0"/>
+          <w:numId w:val="1"/>
+        </w:numPr>
+        <w:tabs>
+          <w:tab w:val="left" w:pos="314"/>
+          <w:tab w:val="left" w:pos="6086"/>
+        </w:tabs>
+        <w:ind w:hanging="230"/>
+        <w:jc w:val="both"/>
+        <w:rPr>
+          <w:u w:val="none"/>
+        </w:rPr>
+      </w:pPr>
+      <w:r>
+        <w:rPr>
+          <w:spacing w:val="-6"/>
+          <w:u w:val="none"/>
+        </w:rPr>
+        <w:t>Automated</w:t>
+      </w:r>
+      <w:r>
+        <w:rPr>
+          <w:spacing w:val="8"/>
+          <w:u w:val="none"/>
+        </w:rPr>
+        <w:t xml:space="preserve"> </w:t>
+      </w:r>
+      <w:r>
+        <w:rPr>
+          <w:spacing w:val="-6"/>
+          <w:u w:val="none"/>
+        </w:rPr>
+        <w:t>Testing</w:t>
+      </w:r>
+      <w:r>
+        <w:rPr>
+          <w:spacing w:val="8"/>
+          <w:u w:val="none"/>
+        </w:rPr>
+        <w:t xml:space="preserve"> </w:t>
+      </w:r>
+      <w:r>
+        <w:rPr>
+          <w:spacing w:val="-6"/>
+          <w:u w:val="none"/>
+        </w:rPr>
+        <w:t>Software</w:t>
+      </w:r>
+      <w:r>
+        <w:rPr>
+          <w:u w:val="none"/>
+        </w:rPr>
+        <w:tab/>
+      </w:r>
+      <w:r>
+        <w:rPr>
+          <w:color w:val="1F487C"/>
+          <w:spacing w:val="-2"/>
+          <w:u w:color="1F487C"/>
+        </w:rPr>
+        <w:t>https://github.com/UtsavShelke/ConfigWhiz.git</w:t>
+      </w:r>
+    </w:p>
+    <w:p>
+      <w:pPr>
+        <w:tabs>
+          <w:tab w:val="left" w:pos="8804"/>
+        </w:tabs>
+        <w:spacing w:before="18"/>
+        <w:ind w:left="314"/>
+        <w:jc w:val="both"/>
+        <w:rPr>
+          <w:sz w:val="18"/>
+        </w:rPr>
+      </w:pPr>
+      <w:r>
+        <w:rPr>
+          <w:rFonts w:ascii="Times New Roman" w:hAnsi="Times New Roman"/>
+          <w:sz w:val="20"/>
+          <w:szCs w:val="24"/>
+        </w:rPr>
+        <w:t>Languages/Tools:</w:t>
+      </w:r>
+      <w:r>
+        <w:rPr>
+          <w:rFonts w:ascii="Times New Roman" w:hAnsi="Times New Roman"/>
+          <w:spacing w:val="38"/>
+          <w:sz w:val="20"/>
+          <w:szCs w:val="24"/>
+        </w:rPr>
+        <w:t xml:space="preserve">  </w:t>
+      </w:r>
+      <w:r>
+        <w:rPr>
+          <w:rFonts w:ascii="Times New Roman" w:hAnsi="Times New Roman"/>
+          <w:sz w:val="20"/>
+          <w:szCs w:val="24"/>
+        </w:rPr>
+        <w:t>React,</w:t>
+      </w:r>
+      <w:r>
+        <w:rPr>
+          <w:rFonts w:ascii="Times New Roman" w:hAnsi="Times New Roman"/>
+          <w:spacing w:val="60"/>
+          <w:w w:val="150"/>
+          <w:sz w:val="20"/>
+          <w:szCs w:val="24"/>
+        </w:rPr>
+        <w:t xml:space="preserve"> </w:t>
+      </w:r>
+      <w:r>
+        <w:rPr>
+          <w:rFonts w:ascii="Times New Roman" w:hAnsi="Times New Roman"/>
+          <w:sz w:val="20"/>
+          <w:szCs w:val="24"/>
+        </w:rPr>
+        <w:t>TypeScript,</w:t>
+      </w:r>
+      <w:r>
+        <w:rPr>
+          <w:rFonts w:ascii="Times New Roman" w:hAnsi="Times New Roman"/>
+          <w:spacing w:val="56"/>
+          <w:w w:val="150"/>
+          <w:sz w:val="20"/>
+          <w:szCs w:val="24"/>
+        </w:rPr>
+        <w:t xml:space="preserve"> </w:t>
+      </w:r>
+      <w:r>
+        <w:rPr>
+          <w:rFonts w:ascii="Times New Roman" w:hAnsi="Times New Roman"/>
+          <w:sz w:val="20"/>
+          <w:szCs w:val="24"/>
+        </w:rPr>
+        <w:t>Frontend</w:t>
+      </w:r>
+      <w:r>
+        <w:rPr>
+          <w:rFonts w:ascii="Times New Roman" w:hAnsi="Times New Roman"/>
+          <w:spacing w:val="79"/>
+          <w:sz w:val="20"/>
+          <w:szCs w:val="24"/>
+        </w:rPr>
+        <w:t xml:space="preserve"> </w:t>
+      </w:r>
+      <w:r>
+        <w:rPr>
+          <w:rFonts w:ascii="Times New Roman" w:hAnsi="Times New Roman"/>
+          <w:sz w:val="20"/>
+          <w:szCs w:val="24"/>
+        </w:rPr>
+        <w:t>Design,</w:t>
+      </w:r>
+      <w:r>
+        <w:rPr>
+          <w:rFonts w:ascii="Times New Roman" w:hAnsi="Times New Roman"/>
+          <w:spacing w:val="-3"/>
+          <w:sz w:val="20"/>
+          <w:szCs w:val="24"/>
+        </w:rPr>
+        <w:t xml:space="preserve"> </w:t>
+      </w:r>
+      <w:r>
+        <w:rPr>
+          <w:rFonts w:ascii="Times New Roman" w:hAnsi="Times New Roman"/>
+          <w:sz w:val="20"/>
+          <w:szCs w:val="24"/>
+        </w:rPr>
+        <w:t>Docker,</w:t>
+      </w:r>
+      <w:r>
+        <w:rPr>
+          <w:rFonts w:ascii="Times New Roman" w:hAnsi="Times New Roman"/>
+          <w:spacing w:val="-3"/>
+          <w:sz w:val="20"/>
+          <w:szCs w:val="24"/>
+        </w:rPr>
+        <w:t xml:space="preserve"> </w:t>
+      </w:r>
+      <w:r>
+        <w:rPr>
+          <w:rFonts w:ascii="Times New Roman" w:hAnsi="Times New Roman"/>
+          <w:spacing w:val="-2"/>
+          <w:sz w:val="20"/>
+          <w:szCs w:val="24"/>
+        </w:rPr>
+        <w:t>Python</w:t>
+      </w:r>
+      <w:r>
+        <w:rPr>
+          <w:rFonts w:ascii="Times New Roman" w:hAnsi="Times New Roman"/>
+          <w:spacing w:val="-2"/>
+          <w:sz w:val="20"/>
+          <w:szCs w:val="24"/>
+        </w:rPr>
+        <w:t>.</w:t>
+      </w:r>
+      <w:r>
+        <w:rPr>
+          <w:rFonts w:ascii="Times New Roman" w:hAnsi="Times New Roman"/>
+          <w:sz w:val="18"/>
+        </w:rPr>
+        <w:tab/>
+      </w:r>
+      <w:r>
+        <w:rPr>
+          <w:sz w:val="18"/>
+        </w:rPr>
+        <w:t>Jul</w:t>
+      </w:r>
+      <w:r>
+        <w:rPr>
+          <w:spacing w:val="-7"/>
+          <w:sz w:val="18"/>
+        </w:rPr>
+        <w:t xml:space="preserve"> </w:t>
+      </w:r>
+      <w:r>
+        <w:rPr>
+          <w:sz w:val="18"/>
+        </w:rPr>
+        <w:t>2025</w:t>
+      </w:r>
+      <w:r>
+        <w:rPr>
+          <w:spacing w:val="-6"/>
+          <w:sz w:val="18"/>
+        </w:rPr>
+        <w:t xml:space="preserve"> </w:t>
+      </w:r>
+      <w:r>
+        <w:rPr>
+          <w:sz w:val="18"/>
+        </w:rPr>
+        <w:t>–</w:t>
+      </w:r>
+      <w:r>
+        <w:rPr>
+          <w:spacing w:val="-2"/>
+          <w:sz w:val="18"/>
+        </w:rPr>
+        <w:t xml:space="preserve"> Oct 2025</w:t>
+      </w:r>
+    </w:p>
+    <w:p>
+      <w:pPr>
+        <w:pStyle w:val="ListParagraph"/>
+        <w:numPr>
+          <w:ilvl w:val="1"/>
+          <w:numId w:val="1"/>
+        </w:numPr>
+        <w:tabs>
+          <w:tab w:val="left" w:pos="348"/>
+        </w:tabs>
+        <w:spacing w:before="49"/>
+        <w:ind w:left="348" w:hanging="134"/>
+        <w:jc w:val="both"/>
+        <w:rPr>
+          <w:sz w:val="20"/>
+        </w:rPr>
+      </w:pPr>
+      <w:r>
+        <w:rPr>
+          <w:spacing w:val="-2"/>
+          <w:sz w:val="20"/>
+        </w:rPr>
+        <w:t>Developed a</w:t>
+      </w:r>
+      <w:r>
+        <w:rPr>
+          <w:spacing w:val="-4"/>
+          <w:sz w:val="20"/>
+        </w:rPr>
+        <w:t xml:space="preserve"> </w:t>
+      </w:r>
+      <w:r>
+        <w:rPr>
+          <w:spacing w:val="-2"/>
+          <w:sz w:val="20"/>
+        </w:rPr>
+        <w:t>frontend</w:t>
+      </w:r>
+      <w:r>
+        <w:rPr>
+          <w:spacing w:val="2"/>
+          <w:sz w:val="20"/>
+        </w:rPr>
+        <w:t xml:space="preserve"> </w:t>
+      </w:r>
+      <w:r>
+        <w:rPr>
+          <w:spacing w:val="-2"/>
+          <w:sz w:val="20"/>
+        </w:rPr>
+        <w:t>interface</w:t>
+      </w:r>
+      <w:r>
+        <w:rPr>
+          <w:spacing w:val="-5"/>
+          <w:sz w:val="20"/>
+        </w:rPr>
+        <w:t xml:space="preserve"> </w:t>
+      </w:r>
+      <w:r>
+        <w:rPr>
+          <w:spacing w:val="-2"/>
+          <w:sz w:val="20"/>
+        </w:rPr>
+        <w:t>for</w:t>
+      </w:r>
+      <w:r>
+        <w:rPr>
+          <w:sz w:val="20"/>
+        </w:rPr>
+        <w:t xml:space="preserve"> </w:t>
+      </w:r>
+      <w:r>
+        <w:rPr>
+          <w:spacing w:val="-2"/>
+          <w:sz w:val="20"/>
+        </w:rPr>
+        <w:t>an</w:t>
+      </w:r>
+      <w:r>
+        <w:rPr>
+          <w:spacing w:val="3"/>
+          <w:sz w:val="20"/>
+        </w:rPr>
+        <w:t xml:space="preserve"> </w:t>
+      </w:r>
+      <w:r>
+        <w:rPr>
+          <w:spacing w:val="-2"/>
+          <w:sz w:val="20"/>
+        </w:rPr>
+        <w:t>Automated</w:t>
+      </w:r>
+      <w:r>
+        <w:rPr>
+          <w:spacing w:val="-3"/>
+          <w:sz w:val="20"/>
+        </w:rPr>
+        <w:t xml:space="preserve"> </w:t>
+      </w:r>
+      <w:r>
+        <w:rPr>
+          <w:spacing w:val="-2"/>
+          <w:sz w:val="20"/>
+        </w:rPr>
+        <w:t>Testing</w:t>
+      </w:r>
+      <w:r>
+        <w:rPr>
+          <w:spacing w:val="-1"/>
+          <w:sz w:val="20"/>
+        </w:rPr>
+        <w:t xml:space="preserve"> </w:t>
+      </w:r>
+      <w:r>
+        <w:rPr>
+          <w:spacing w:val="-2"/>
+          <w:sz w:val="20"/>
+        </w:rPr>
+        <w:t>Software</w:t>
+      </w:r>
+      <w:r>
+        <w:rPr>
+          <w:spacing w:val="-5"/>
+          <w:sz w:val="20"/>
+        </w:rPr>
+        <w:t xml:space="preserve"> </w:t>
+      </w:r>
+      <w:r>
+        <w:rPr>
+          <w:spacing w:val="-2"/>
+          <w:sz w:val="20"/>
+        </w:rPr>
+        <w:t>using</w:t>
+      </w:r>
+      <w:r>
+        <w:rPr>
+          <w:sz w:val="20"/>
+        </w:rPr>
+        <w:t xml:space="preserve"> </w:t>
+      </w:r>
+      <w:r>
+        <w:rPr>
+          <w:spacing w:val="-2"/>
+          <w:sz w:val="20"/>
+        </w:rPr>
+        <w:t>React</w:t>
+      </w:r>
+      <w:r>
+        <w:rPr>
+          <w:spacing w:val="4"/>
+          <w:sz w:val="20"/>
+        </w:rPr>
+        <w:t xml:space="preserve"> </w:t>
+      </w:r>
+      <w:r>
+        <w:rPr>
+          <w:spacing w:val="-2"/>
+          <w:sz w:val="20"/>
+        </w:rPr>
+        <w:t>and</w:t>
+      </w:r>
+      <w:r>
+        <w:rPr>
+          <w:spacing w:val="1"/>
+          <w:sz w:val="20"/>
+        </w:rPr>
+        <w:t xml:space="preserve"> </w:t>
+      </w:r>
+      <w:r>
+        <w:rPr>
+          <w:spacing w:val="-2"/>
+          <w:sz w:val="20"/>
+        </w:rPr>
+        <w:t>TypeScript</w:t>
+      </w:r>
+      <w:r>
+        <w:rPr>
+          <w:spacing w:val="-2"/>
+          <w:sz w:val="20"/>
+        </w:rPr>
+        <w:t>.</w:t>
+      </w:r>
+    </w:p>
+    <w:p>
+      <w:pPr>
+        <w:pStyle w:val="ListParagraph"/>
+        <w:numPr>
+          <w:ilvl w:val="1"/>
+          <w:numId w:val="1"/>
+        </w:numPr>
+        <w:tabs>
+          <w:tab w:val="left" w:pos="348"/>
+        </w:tabs>
+        <w:ind w:left="348" w:hanging="134"/>
+        <w:jc w:val="both"/>
+        <w:rPr>
+          <w:sz w:val="20"/>
+        </w:rPr>
+      </w:pPr>
+      <w:r>
+        <w:rPr>
+          <w:spacing w:val="-2"/>
+          <w:sz w:val="20"/>
+        </w:rPr>
+        <w:t>Designed</w:t>
+      </w:r>
+      <w:r>
+        <w:rPr>
+          <w:spacing w:val="-7"/>
+          <w:sz w:val="20"/>
+        </w:rPr>
+        <w:t xml:space="preserve"> </w:t>
+      </w:r>
+      <w:r>
+        <w:rPr>
+          <w:spacing w:val="-2"/>
+          <w:sz w:val="20"/>
+        </w:rPr>
+        <w:t>modular</w:t>
+      </w:r>
+      <w:r>
+        <w:rPr>
+          <w:spacing w:val="-6"/>
+          <w:sz w:val="20"/>
+        </w:rPr>
+        <w:t xml:space="preserve"> </w:t>
+      </w:r>
+      <w:r>
+        <w:rPr>
+          <w:spacing w:val="-2"/>
+          <w:sz w:val="20"/>
+        </w:rPr>
+        <w:t>UI</w:t>
+      </w:r>
+      <w:r>
+        <w:rPr>
+          <w:spacing w:val="-5"/>
+          <w:sz w:val="20"/>
+        </w:rPr>
+        <w:t xml:space="preserve"> </w:t>
+      </w:r>
+      <w:r>
+        <w:rPr>
+          <w:spacing w:val="-2"/>
+          <w:sz w:val="20"/>
+        </w:rPr>
+        <w:t>components</w:t>
+      </w:r>
+      <w:r>
+        <w:rPr>
+          <w:spacing w:val="-5"/>
+          <w:sz w:val="20"/>
+        </w:rPr>
+        <w:t xml:space="preserve"> </w:t>
+      </w:r>
+      <w:r>
+        <w:rPr>
+          <w:spacing w:val="-2"/>
+          <w:sz w:val="20"/>
+        </w:rPr>
+        <w:t>to display</w:t>
+      </w:r>
+      <w:r>
+        <w:rPr>
+          <w:spacing w:val="-7"/>
+          <w:sz w:val="20"/>
+        </w:rPr>
+        <w:t xml:space="preserve"> </w:t>
+      </w:r>
+      <w:r>
+        <w:rPr>
+          <w:spacing w:val="-2"/>
+          <w:sz w:val="20"/>
+        </w:rPr>
+        <w:t>code</w:t>
+      </w:r>
+      <w:r>
+        <w:rPr>
+          <w:spacing w:val="-6"/>
+          <w:sz w:val="20"/>
+        </w:rPr>
+        <w:t xml:space="preserve"> </w:t>
+      </w:r>
+      <w:r>
+        <w:rPr>
+          <w:spacing w:val="-2"/>
+          <w:sz w:val="20"/>
+        </w:rPr>
+        <w:t>input,</w:t>
+      </w:r>
+      <w:r>
+        <w:rPr>
+          <w:spacing w:val="-10"/>
+          <w:sz w:val="20"/>
+        </w:rPr>
+        <w:t xml:space="preserve"> </w:t>
+      </w:r>
+      <w:r>
+        <w:rPr>
+          <w:spacing w:val="-2"/>
+          <w:sz w:val="20"/>
+        </w:rPr>
+        <w:t>testing</w:t>
+      </w:r>
+      <w:r>
+        <w:rPr>
+          <w:spacing w:val="-6"/>
+          <w:sz w:val="20"/>
+        </w:rPr>
+        <w:t xml:space="preserve"> </w:t>
+      </w:r>
+      <w:r>
+        <w:rPr>
+          <w:spacing w:val="-2"/>
+          <w:sz w:val="20"/>
+        </w:rPr>
+        <w:t>results,</w:t>
+      </w:r>
+      <w:r>
+        <w:rPr>
+          <w:spacing w:val="-5"/>
+          <w:sz w:val="20"/>
+        </w:rPr>
+        <w:t xml:space="preserve"> </w:t>
+      </w:r>
+      <w:r>
+        <w:rPr>
+          <w:spacing w:val="-2"/>
+          <w:sz w:val="20"/>
+        </w:rPr>
+        <w:t>and</w:t>
+      </w:r>
+      <w:r>
+        <w:rPr>
+          <w:spacing w:val="-5"/>
+          <w:sz w:val="20"/>
+        </w:rPr>
+        <w:t xml:space="preserve"> </w:t>
+      </w:r>
+      <w:r>
+        <w:rPr>
+          <w:spacing w:val="-2"/>
+          <w:sz w:val="20"/>
+        </w:rPr>
+        <w:t>performance</w:t>
+      </w:r>
+      <w:r>
+        <w:rPr>
+          <w:spacing w:val="-5"/>
+          <w:sz w:val="20"/>
+        </w:rPr>
+        <w:t xml:space="preserve"> </w:t>
+      </w:r>
+      <w:r>
+        <w:rPr>
+          <w:spacing w:val="-2"/>
+          <w:sz w:val="20"/>
+        </w:rPr>
+        <w:t>metrics</w:t>
+      </w:r>
+      <w:r>
+        <w:rPr>
+          <w:spacing w:val="-2"/>
+          <w:sz w:val="20"/>
+        </w:rPr>
+        <w:t>.</w:t>
+      </w:r>
+    </w:p>
+    <w:p>
+      <w:pPr>
+        <w:pStyle w:val="ListParagraph"/>
+        <w:numPr>
+          <w:ilvl w:val="1"/>
+          <w:numId w:val="1"/>
+        </w:numPr>
+        <w:tabs>
+          <w:tab w:val="left" w:pos="348"/>
+        </w:tabs>
+        <w:ind w:left="348" w:hanging="134"/>
+        <w:jc w:val="both"/>
+        <w:rPr>
+          <w:sz w:val="20"/>
+        </w:rPr>
+      </w:pPr>
+      <w:r>
+        <w:rPr>
+          <w:spacing w:val="-4"/>
+          <w:sz w:val="20"/>
+        </w:rPr>
+        <w:t>Implemented</w:t>
+      </w:r>
+      <w:r>
+        <w:rPr>
+          <w:spacing w:val="-3"/>
+          <w:sz w:val="20"/>
+        </w:rPr>
+        <w:t xml:space="preserve"> </w:t>
+      </w:r>
+      <w:r>
+        <w:rPr>
+          <w:spacing w:val="-4"/>
+          <w:sz w:val="20"/>
+        </w:rPr>
+        <w:t>interactive</w:t>
+      </w:r>
+      <w:r>
+        <w:rPr>
+          <w:spacing w:val="1"/>
+          <w:sz w:val="20"/>
+        </w:rPr>
+        <w:t xml:space="preserve"> </w:t>
+      </w:r>
+      <w:r>
+        <w:rPr>
+          <w:spacing w:val="-4"/>
+          <w:sz w:val="20"/>
+        </w:rPr>
+        <w:t>forms and</w:t>
+      </w:r>
+      <w:r>
+        <w:rPr>
+          <w:spacing w:val="1"/>
+          <w:sz w:val="20"/>
+        </w:rPr>
+        <w:t xml:space="preserve"> </w:t>
+      </w:r>
+      <w:r>
+        <w:rPr>
+          <w:spacing w:val="-4"/>
+          <w:sz w:val="20"/>
+        </w:rPr>
+        <w:t>dashboards</w:t>
+      </w:r>
+      <w:r>
+        <w:rPr>
+          <w:spacing w:val="1"/>
+          <w:sz w:val="20"/>
+        </w:rPr>
+        <w:t xml:space="preserve"> </w:t>
+      </w:r>
+      <w:r>
+        <w:rPr>
+          <w:spacing w:val="-4"/>
+          <w:sz w:val="20"/>
+        </w:rPr>
+        <w:t>to</w:t>
+      </w:r>
+      <w:r>
+        <w:rPr>
+          <w:spacing w:val="-2"/>
+          <w:sz w:val="20"/>
+        </w:rPr>
+        <w:t xml:space="preserve"> </w:t>
+      </w:r>
+      <w:r>
+        <w:rPr>
+          <w:spacing w:val="-4"/>
+          <w:sz w:val="20"/>
+        </w:rPr>
+        <w:t>enhance</w:t>
+      </w:r>
+      <w:r>
+        <w:rPr>
+          <w:spacing w:val="1"/>
+          <w:sz w:val="20"/>
+        </w:rPr>
+        <w:t xml:space="preserve"> </w:t>
+      </w:r>
+      <w:r>
+        <w:rPr>
+          <w:spacing w:val="-4"/>
           <w:sz w:val="20"/>
         </w:rPr>
         <w:t>user</w:t>
       </w:r>
       <w:r>
         <w:rPr>
-          <w:spacing w:val="-11"/>
-          <w:sz w:val="20"/>
-        </w:rPr>
-        <w:t xml:space="preserve"> </w:t>
-      </w:r>
-      <w:r>
-        <w:rPr>
-          <w:spacing w:val="-2"/>
+          <w:spacing w:val="2"/>
+          <w:sz w:val="20"/>
+        </w:rPr>
+        <w:t xml:space="preserve"> </w:t>
+      </w:r>
+      <w:r>
+        <w:rPr>
+          <w:spacing w:val="-4"/>
           <w:sz w:val="20"/>
         </w:rPr>
         <w:t>experience</w:t>
       </w:r>
       <w:r>
         <w:rPr>
-          <w:spacing w:val="-9"/>
-          <w:sz w:val="20"/>
-        </w:rPr>
-        <w:t xml:space="preserve"> </w:t>
-      </w:r>
-      <w:r>
-        <w:rPr>
-          <w:spacing w:val="-2"/>
-          <w:sz w:val="20"/>
-        </w:rPr>
-        <w:t>with</w:t>
-      </w:r>
-      <w:r>
-        <w:rPr>
-          <w:spacing w:val="-5"/>
-          <w:sz w:val="20"/>
-        </w:rPr>
-        <w:t xml:space="preserve"> </w:t>
-      </w:r>
-      <w:r>
-        <w:rPr>
-          <w:spacing w:val="-2"/>
-          <w:sz w:val="20"/>
-        </w:rPr>
-        <w:t>tools</w:t>
-      </w:r>
-      <w:r>
-        <w:rPr>
-          <w:spacing w:val="-8"/>
-          <w:sz w:val="20"/>
-        </w:rPr>
-        <w:t xml:space="preserve"> </w:t>
-      </w:r>
-      <w:r>
-        <w:rPr>
-          <w:spacing w:val="-2"/>
-          <w:sz w:val="20"/>
-        </w:rPr>
-        <w:t>to</w:t>
-      </w:r>
-      <w:r>
-        <w:rPr>
-          <w:spacing w:val="-10"/>
-          <w:sz w:val="20"/>
-        </w:rPr>
-        <w:t xml:space="preserve"> </w:t>
-      </w:r>
-      <w:r>
-        <w:rPr>
-          <w:spacing w:val="-2"/>
-          <w:sz w:val="20"/>
-        </w:rPr>
-        <w:t>make</w:t>
-      </w:r>
-      <w:r>
-        <w:rPr>
-          <w:spacing w:val="-8"/>
-          <w:sz w:val="20"/>
-        </w:rPr>
-        <w:t xml:space="preserve"> </w:t>
-      </w:r>
-      <w:r>
-        <w:rPr>
-          <w:spacing w:val="-2"/>
-          <w:sz w:val="20"/>
-        </w:rPr>
-        <w:t>music</w:t>
-      </w:r>
-      <w:r>
-        <w:rPr>
-          <w:spacing w:val="-8"/>
-          <w:sz w:val="20"/>
-        </w:rPr>
-        <w:t xml:space="preserve"> </w:t>
-      </w:r>
-      <w:r>
-        <w:rPr>
-          <w:spacing w:val="-2"/>
-          <w:sz w:val="20"/>
-        </w:rPr>
-        <w:t>your</w:t>
-      </w:r>
-      <w:r>
-        <w:rPr>
-          <w:spacing w:val="-8"/>
-          <w:sz w:val="20"/>
-        </w:rPr>
-        <w:t xml:space="preserve"> </w:t>
-      </w:r>
-      <w:r>
-        <w:rPr>
           <w:spacing w:val="-4"/>
           <w:sz w:val="20"/>
         </w:rPr>
-        <w:t>own.</w:t>
+        <w:t>.</w:t>
       </w:r>
     </w:p>
     <w:p>
@@ -3506,6 +4272,7 @@
         </w:tabs>
         <w:spacing w:before="97"/>
         <w:ind w:hanging="230"/>
+        <w:jc w:val="both"/>
         <w:rPr>
           <w:u w:val="none"/>
         </w:rPr>
@@ -3575,6 +4342,7 @@
         </w:tabs>
         <w:spacing w:before="18"/>
         <w:ind w:left="314"/>
+        <w:jc w:val="both"/>
         <w:rPr>
           <w:sz w:val="18"/>
         </w:rPr>
@@ -3761,6 +4529,7 @@
         </w:tabs>
         <w:spacing w:before="54"/>
         <w:ind w:left="348" w:hanging="134"/>
+        <w:jc w:val="both"/>
         <w:rPr>
           <w:sz w:val="20"/>
         </w:rPr>
@@ -3924,6 +4693,7 @@
           <w:tab w:val="left" w:pos="348"/>
         </w:tabs>
         <w:ind w:left="348" w:hanging="134"/>
+        <w:jc w:val="both"/>
         <w:rPr>
           <w:sz w:val="20"/>
         </w:rPr>
@@ -4032,6 +4802,7 @@
         </w:tabs>
         <w:spacing w:before="61"/>
         <w:ind w:left="348" w:hanging="134"/>
+        <w:jc w:val="both"/>
         <w:rPr>
           <w:sz w:val="20"/>
         </w:rPr>
@@ -4168,841 +4939,6 @@
           <w:sz w:val="20"/>
         </w:rPr>
         <w:t>users.</w:t>
-      </w:r>
-    </w:p>
-    <w:p>
-      <w:pPr>
-        <w:pStyle w:val="Heading1"/>
-        <w:numPr>
-          <w:ilvl w:val="0"/>
-          <w:numId w:val="1"/>
-        </w:numPr>
-        <w:tabs>
-          <w:tab w:val="left" w:pos="314"/>
-          <w:tab w:val="left" w:pos="6086"/>
-        </w:tabs>
-        <w:ind w:hanging="230"/>
-        <w:rPr>
-          <w:u w:val="none"/>
-        </w:rPr>
-      </w:pPr>
-      <w:r>
-        <w:rPr>
-          <w:spacing w:val="-6"/>
-          <w:u w:val="none"/>
-        </w:rPr>
-        <w:t>Automated</w:t>
-      </w:r>
-      <w:r>
-        <w:rPr>
-          <w:spacing w:val="8"/>
-          <w:u w:val="none"/>
-        </w:rPr>
-        <w:t xml:space="preserve"> </w:t>
-      </w:r>
-      <w:r>
-        <w:rPr>
-          <w:spacing w:val="-6"/>
-          <w:u w:val="none"/>
-        </w:rPr>
-        <w:t>Testing</w:t>
-      </w:r>
-      <w:r>
-        <w:rPr>
-          <w:spacing w:val="8"/>
-          <w:u w:val="none"/>
-        </w:rPr>
-        <w:t xml:space="preserve"> </w:t>
-      </w:r>
-      <w:r>
-        <w:rPr>
-          <w:spacing w:val="-6"/>
-          <w:u w:val="none"/>
-        </w:rPr>
-        <w:t>Software</w:t>
-      </w:r>
-      <w:r>
-        <w:rPr>
-          <w:u w:val="none"/>
-        </w:rPr>
-        <w:tab/>
-      </w:r>
-      <w:r>
-        <w:rPr>
-          <w:color w:val="1F487C"/>
-          <w:spacing w:val="-2"/>
-          <w:u w:color="1F487C"/>
-        </w:rPr>
-        <w:t>https://github.com/UtsavShelke/ConfigWhiz.git</w:t>
-      </w:r>
-    </w:p>
-    <w:p>
-      <w:pPr>
-        <w:tabs>
-          <w:tab w:val="left" w:pos="8804"/>
-        </w:tabs>
-        <w:spacing w:before="18"/>
-        <w:ind w:left="314"/>
-        <w:rPr>
-          <w:sz w:val="18"/>
-        </w:rPr>
-      </w:pPr>
-      <w:r>
-        <w:rPr>
-          <w:rFonts w:ascii="Times New Roman" w:hAnsi="Times New Roman"/>
-          <w:sz w:val="20"/>
-          <w:szCs w:val="24"/>
-        </w:rPr>
-        <w:t>Languages/Tools:</w:t>
-      </w:r>
-      <w:r>
-        <w:rPr>
-          <w:rFonts w:ascii="Times New Roman" w:hAnsi="Times New Roman"/>
-          <w:spacing w:val="38"/>
-          <w:sz w:val="20"/>
-          <w:szCs w:val="24"/>
-        </w:rPr>
-        <w:t xml:space="preserve">  </w:t>
-      </w:r>
-      <w:r>
-        <w:rPr>
-          <w:rFonts w:ascii="Times New Roman" w:hAnsi="Times New Roman"/>
-          <w:sz w:val="20"/>
-          <w:szCs w:val="24"/>
-        </w:rPr>
-        <w:t>React,</w:t>
-      </w:r>
-      <w:r>
-        <w:rPr>
-          <w:rFonts w:ascii="Times New Roman" w:hAnsi="Times New Roman"/>
-          <w:spacing w:val="60"/>
-          <w:w w:val="150"/>
-          <w:sz w:val="20"/>
-          <w:szCs w:val="24"/>
-        </w:rPr>
-        <w:t xml:space="preserve"> </w:t>
-      </w:r>
-      <w:r>
-        <w:rPr>
-          <w:rFonts w:ascii="Times New Roman" w:hAnsi="Times New Roman"/>
-          <w:sz w:val="20"/>
-          <w:szCs w:val="24"/>
-        </w:rPr>
-        <w:t>TypeScript,</w:t>
-      </w:r>
-      <w:r>
-        <w:rPr>
-          <w:rFonts w:ascii="Times New Roman" w:hAnsi="Times New Roman"/>
-          <w:spacing w:val="56"/>
-          <w:w w:val="150"/>
-          <w:sz w:val="20"/>
-          <w:szCs w:val="24"/>
-        </w:rPr>
-        <w:t xml:space="preserve"> </w:t>
-      </w:r>
-      <w:r>
-        <w:rPr>
-          <w:rFonts w:ascii="Times New Roman" w:hAnsi="Times New Roman"/>
-          <w:sz w:val="20"/>
-          <w:szCs w:val="24"/>
-        </w:rPr>
-        <w:t>Frontend</w:t>
-      </w:r>
-      <w:r>
-        <w:rPr>
-          <w:rFonts w:ascii="Times New Roman" w:hAnsi="Times New Roman"/>
-          <w:spacing w:val="79"/>
-          <w:sz w:val="20"/>
-          <w:szCs w:val="24"/>
-        </w:rPr>
-        <w:t xml:space="preserve"> </w:t>
-      </w:r>
-      <w:r>
-        <w:rPr>
-          <w:rFonts w:ascii="Times New Roman" w:hAnsi="Times New Roman"/>
-          <w:sz w:val="20"/>
-          <w:szCs w:val="24"/>
-        </w:rPr>
-        <w:t>Design,</w:t>
-      </w:r>
-      <w:r>
-        <w:rPr>
-          <w:rFonts w:ascii="Times New Roman" w:hAnsi="Times New Roman"/>
-          <w:spacing w:val="-3"/>
-          <w:sz w:val="20"/>
-          <w:szCs w:val="24"/>
-        </w:rPr>
-        <w:t xml:space="preserve"> </w:t>
-      </w:r>
-      <w:r>
-        <w:rPr>
-          <w:rFonts w:ascii="Times New Roman" w:hAnsi="Times New Roman"/>
-          <w:sz w:val="20"/>
-          <w:szCs w:val="24"/>
-        </w:rPr>
-        <w:t>Docker,</w:t>
-      </w:r>
-      <w:r>
-        <w:rPr>
-          <w:rFonts w:ascii="Times New Roman" w:hAnsi="Times New Roman"/>
-          <w:spacing w:val="-3"/>
-          <w:sz w:val="20"/>
-          <w:szCs w:val="24"/>
-        </w:rPr>
-        <w:t xml:space="preserve"> </w:t>
-      </w:r>
-      <w:r>
-        <w:rPr>
-          <w:rFonts w:ascii="Times New Roman" w:hAnsi="Times New Roman"/>
-          <w:spacing w:val="-2"/>
-          <w:sz w:val="20"/>
-          <w:szCs w:val="24"/>
-        </w:rPr>
-        <w:t>Python</w:t>
-      </w:r>
-      <w:r>
-        <w:rPr>
-          <w:rFonts w:ascii="Times New Roman" w:hAnsi="Times New Roman"/>
-          <w:spacing w:val="-2"/>
-          <w:sz w:val="20"/>
-          <w:szCs w:val="24"/>
-        </w:rPr>
-        <w:t>.</w:t>
-      </w:r>
-      <w:r>
-        <w:rPr>
-          <w:rFonts w:ascii="Times New Roman" w:hAnsi="Times New Roman"/>
-          <w:sz w:val="18"/>
-        </w:rPr>
-        <w:tab/>
-      </w:r>
-      <w:r>
-        <w:rPr>
-          <w:sz w:val="18"/>
-        </w:rPr>
-        <w:t>Jul</w:t>
-      </w:r>
-      <w:r>
-        <w:rPr>
-          <w:spacing w:val="-7"/>
-          <w:sz w:val="18"/>
-        </w:rPr>
-        <w:t xml:space="preserve"> </w:t>
-      </w:r>
-      <w:r>
-        <w:rPr>
-          <w:sz w:val="18"/>
-        </w:rPr>
-        <w:t>2025</w:t>
-      </w:r>
-      <w:r>
-        <w:rPr>
-          <w:spacing w:val="-6"/>
-          <w:sz w:val="18"/>
-        </w:rPr>
-        <w:t xml:space="preserve"> </w:t>
-      </w:r>
-      <w:r>
-        <w:rPr>
-          <w:sz w:val="18"/>
-        </w:rPr>
-        <w:t>–</w:t>
-      </w:r>
-      <w:r>
-        <w:rPr>
-          <w:spacing w:val="-11"/>
-          <w:sz w:val="18"/>
-        </w:rPr>
-        <w:t xml:space="preserve"> </w:t>
-      </w:r>
-      <w:r>
-        <w:rPr>
-          <w:spacing w:val="-2"/>
-          <w:sz w:val="18"/>
-        </w:rPr>
-        <w:t>Present</w:t>
-      </w:r>
-    </w:p>
-    <w:p>
-      <w:pPr>
-        <w:pStyle w:val="ListParagraph"/>
-        <w:numPr>
-          <w:ilvl w:val="1"/>
-          <w:numId w:val="1"/>
-        </w:numPr>
-        <w:tabs>
-          <w:tab w:val="left" w:pos="348"/>
-        </w:tabs>
-        <w:spacing w:before="49"/>
-        <w:ind w:left="348" w:hanging="134"/>
-        <w:rPr>
-          <w:sz w:val="20"/>
-        </w:rPr>
-      </w:pPr>
-      <w:r>
-        <w:rPr>
-          <w:spacing w:val="-2"/>
-          <w:sz w:val="20"/>
-        </w:rPr>
-        <w:t>Developed a</w:t>
-      </w:r>
-      <w:r>
-        <w:rPr>
-          <w:spacing w:val="-4"/>
-          <w:sz w:val="20"/>
-        </w:rPr>
-        <w:t xml:space="preserve"> </w:t>
-      </w:r>
-      <w:r>
-        <w:rPr>
-          <w:spacing w:val="-2"/>
-          <w:sz w:val="20"/>
-        </w:rPr>
-        <w:t>frontend</w:t>
-      </w:r>
-      <w:r>
-        <w:rPr>
-          <w:spacing w:val="2"/>
-          <w:sz w:val="20"/>
-        </w:rPr>
-        <w:t xml:space="preserve"> </w:t>
-      </w:r>
-      <w:r>
-        <w:rPr>
-          <w:spacing w:val="-2"/>
-          <w:sz w:val="20"/>
-        </w:rPr>
-        <w:t>interface</w:t>
-      </w:r>
-      <w:r>
-        <w:rPr>
-          <w:spacing w:val="-5"/>
-          <w:sz w:val="20"/>
-        </w:rPr>
-        <w:t xml:space="preserve"> </w:t>
-      </w:r>
-      <w:r>
-        <w:rPr>
-          <w:spacing w:val="-2"/>
-          <w:sz w:val="20"/>
-        </w:rPr>
-        <w:t>for</w:t>
-      </w:r>
-      <w:r>
-        <w:rPr>
-          <w:sz w:val="20"/>
-        </w:rPr>
-        <w:t xml:space="preserve"> </w:t>
-      </w:r>
-      <w:r>
-        <w:rPr>
-          <w:spacing w:val="-2"/>
-          <w:sz w:val="20"/>
-        </w:rPr>
-        <w:t>an</w:t>
-      </w:r>
-      <w:r>
-        <w:rPr>
-          <w:spacing w:val="3"/>
-          <w:sz w:val="20"/>
-        </w:rPr>
-        <w:t xml:space="preserve"> </w:t>
-      </w:r>
-      <w:r>
-        <w:rPr>
-          <w:spacing w:val="-2"/>
-          <w:sz w:val="20"/>
-        </w:rPr>
-        <w:t>Automated</w:t>
-      </w:r>
-      <w:r>
-        <w:rPr>
-          <w:spacing w:val="-3"/>
-          <w:sz w:val="20"/>
-        </w:rPr>
-        <w:t xml:space="preserve"> </w:t>
-      </w:r>
-      <w:r>
-        <w:rPr>
-          <w:spacing w:val="-2"/>
-          <w:sz w:val="20"/>
-        </w:rPr>
-        <w:t>Testing</w:t>
-      </w:r>
-      <w:r>
-        <w:rPr>
-          <w:spacing w:val="-1"/>
-          <w:sz w:val="20"/>
-        </w:rPr>
-        <w:t xml:space="preserve"> </w:t>
-      </w:r>
-      <w:r>
-        <w:rPr>
-          <w:spacing w:val="-2"/>
-          <w:sz w:val="20"/>
-        </w:rPr>
-        <w:t>Software</w:t>
-      </w:r>
-      <w:r>
-        <w:rPr>
-          <w:spacing w:val="-5"/>
-          <w:sz w:val="20"/>
-        </w:rPr>
-        <w:t xml:space="preserve"> </w:t>
-      </w:r>
-      <w:r>
-        <w:rPr>
-          <w:spacing w:val="-2"/>
-          <w:sz w:val="20"/>
-        </w:rPr>
-        <w:t>using</w:t>
-      </w:r>
-      <w:r>
-        <w:rPr>
-          <w:sz w:val="20"/>
-        </w:rPr>
-        <w:t xml:space="preserve"> </w:t>
-      </w:r>
-      <w:r>
-        <w:rPr>
-          <w:spacing w:val="-2"/>
-          <w:sz w:val="20"/>
-        </w:rPr>
-        <w:t>React</w:t>
-      </w:r>
-      <w:r>
-        <w:rPr>
-          <w:spacing w:val="4"/>
-          <w:sz w:val="20"/>
-        </w:rPr>
-        <w:t xml:space="preserve"> </w:t>
-      </w:r>
-      <w:r>
-        <w:rPr>
-          <w:spacing w:val="-2"/>
-          <w:sz w:val="20"/>
-        </w:rPr>
-        <w:t>and</w:t>
-      </w:r>
-      <w:r>
-        <w:rPr>
-          <w:spacing w:val="1"/>
-          <w:sz w:val="20"/>
-        </w:rPr>
-        <w:t xml:space="preserve"> </w:t>
-      </w:r>
-      <w:r>
-        <w:rPr>
-          <w:spacing w:val="-2"/>
-          <w:sz w:val="20"/>
-        </w:rPr>
-        <w:t>TypeScript</w:t>
-      </w:r>
-      <w:r>
-        <w:rPr>
-          <w:spacing w:val="-2"/>
-          <w:sz w:val="20"/>
-        </w:rPr>
-        <w:t>.</w:t>
-      </w:r>
-    </w:p>
-    <w:p>
-      <w:pPr>
-        <w:pStyle w:val="ListParagraph"/>
-        <w:numPr>
-          <w:ilvl w:val="1"/>
-          <w:numId w:val="1"/>
-        </w:numPr>
-        <w:tabs>
-          <w:tab w:val="left" w:pos="348"/>
-        </w:tabs>
-        <w:ind w:left="348" w:hanging="134"/>
-        <w:rPr>
-          <w:sz w:val="20"/>
-        </w:rPr>
-      </w:pPr>
-      <w:r>
-        <w:rPr>
-          <w:spacing w:val="-2"/>
-          <w:sz w:val="20"/>
-        </w:rPr>
-        <w:t>Designed</w:t>
-      </w:r>
-      <w:r>
-        <w:rPr>
-          <w:spacing w:val="-7"/>
-          <w:sz w:val="20"/>
-        </w:rPr>
-        <w:t xml:space="preserve"> </w:t>
-      </w:r>
-      <w:r>
-        <w:rPr>
-          <w:spacing w:val="-2"/>
-          <w:sz w:val="20"/>
-        </w:rPr>
-        <w:t>modular</w:t>
-      </w:r>
-      <w:r>
-        <w:rPr>
-          <w:spacing w:val="-6"/>
-          <w:sz w:val="20"/>
-        </w:rPr>
-        <w:t xml:space="preserve"> </w:t>
-      </w:r>
-      <w:r>
-        <w:rPr>
-          <w:spacing w:val="-2"/>
-          <w:sz w:val="20"/>
-        </w:rPr>
-        <w:t>UI</w:t>
-      </w:r>
-      <w:r>
-        <w:rPr>
-          <w:spacing w:val="-5"/>
-          <w:sz w:val="20"/>
-        </w:rPr>
-        <w:t xml:space="preserve"> </w:t>
-      </w:r>
-      <w:r>
-        <w:rPr>
-          <w:spacing w:val="-2"/>
-          <w:sz w:val="20"/>
-        </w:rPr>
-        <w:t>components</w:t>
-      </w:r>
-      <w:r>
-        <w:rPr>
-          <w:spacing w:val="-5"/>
-          <w:sz w:val="20"/>
-        </w:rPr>
-        <w:t xml:space="preserve"> </w:t>
-      </w:r>
-      <w:r>
-        <w:rPr>
-          <w:spacing w:val="-2"/>
-          <w:sz w:val="20"/>
-        </w:rPr>
-        <w:t>to display</w:t>
-      </w:r>
-      <w:r>
-        <w:rPr>
-          <w:spacing w:val="-7"/>
-          <w:sz w:val="20"/>
-        </w:rPr>
-        <w:t xml:space="preserve"> </w:t>
-      </w:r>
-      <w:r>
-        <w:rPr>
-          <w:spacing w:val="-2"/>
-          <w:sz w:val="20"/>
-        </w:rPr>
-        <w:t>code</w:t>
-      </w:r>
-      <w:r>
-        <w:rPr>
-          <w:spacing w:val="-6"/>
-          <w:sz w:val="20"/>
-        </w:rPr>
-        <w:t xml:space="preserve"> </w:t>
-      </w:r>
-      <w:r>
-        <w:rPr>
-          <w:spacing w:val="-2"/>
-          <w:sz w:val="20"/>
-        </w:rPr>
-        <w:t>input,</w:t>
-      </w:r>
-      <w:r>
-        <w:rPr>
-          <w:spacing w:val="-10"/>
-          <w:sz w:val="20"/>
-        </w:rPr>
-        <w:t xml:space="preserve"> </w:t>
-      </w:r>
-      <w:r>
-        <w:rPr>
-          <w:spacing w:val="-2"/>
-          <w:sz w:val="20"/>
-        </w:rPr>
-        <w:t>testing</w:t>
-      </w:r>
-      <w:r>
-        <w:rPr>
-          <w:spacing w:val="-6"/>
-          <w:sz w:val="20"/>
-        </w:rPr>
-        <w:t xml:space="preserve"> </w:t>
-      </w:r>
-      <w:r>
-        <w:rPr>
-          <w:spacing w:val="-2"/>
-          <w:sz w:val="20"/>
-        </w:rPr>
-        <w:t>results,</w:t>
-      </w:r>
-      <w:r>
-        <w:rPr>
-          <w:spacing w:val="-5"/>
-          <w:sz w:val="20"/>
-        </w:rPr>
-        <w:t xml:space="preserve"> </w:t>
-      </w:r>
-      <w:r>
-        <w:rPr>
-          <w:spacing w:val="-2"/>
-          <w:sz w:val="20"/>
-        </w:rPr>
-        <w:t>and</w:t>
-      </w:r>
-      <w:r>
-        <w:rPr>
-          <w:spacing w:val="-5"/>
-          <w:sz w:val="20"/>
-        </w:rPr>
-        <w:t xml:space="preserve"> </w:t>
-      </w:r>
-      <w:r>
-        <w:rPr>
-          <w:spacing w:val="-2"/>
-          <w:sz w:val="20"/>
-        </w:rPr>
-        <w:t>performance</w:t>
-      </w:r>
-      <w:r>
-        <w:rPr>
-          <w:spacing w:val="-5"/>
-          <w:sz w:val="20"/>
-        </w:rPr>
-        <w:t xml:space="preserve"> </w:t>
-      </w:r>
-      <w:r>
-        <w:rPr>
-          <w:spacing w:val="-2"/>
-          <w:sz w:val="20"/>
-        </w:rPr>
-        <w:t>metrics</w:t>
-      </w:r>
-      <w:r>
-        <w:rPr>
-          <w:spacing w:val="-2"/>
-          <w:sz w:val="20"/>
-        </w:rPr>
-        <w:t>.</w:t>
-      </w:r>
-    </w:p>
-    <w:p>
-      <w:pPr>
-        <w:pStyle w:val="ListParagraph"/>
-        <w:numPr>
-          <w:ilvl w:val="1"/>
-          <w:numId w:val="1"/>
-        </w:numPr>
-        <w:tabs>
-          <w:tab w:val="left" w:pos="348"/>
-        </w:tabs>
-        <w:ind w:left="348" w:hanging="134"/>
-        <w:rPr>
-          <w:sz w:val="20"/>
-        </w:rPr>
-      </w:pPr>
-      <w:r>
-        <w:rPr>
-          <w:spacing w:val="-4"/>
-          <w:sz w:val="20"/>
-        </w:rPr>
-        <w:t>Implemented</w:t>
-      </w:r>
-      <w:r>
-        <w:rPr>
-          <w:spacing w:val="-3"/>
-          <w:sz w:val="20"/>
-        </w:rPr>
-        <w:t xml:space="preserve"> </w:t>
-      </w:r>
-      <w:r>
-        <w:rPr>
-          <w:spacing w:val="-4"/>
-          <w:sz w:val="20"/>
-        </w:rPr>
-        <w:t>interactive</w:t>
-      </w:r>
-      <w:r>
-        <w:rPr>
-          <w:spacing w:val="1"/>
-          <w:sz w:val="20"/>
-        </w:rPr>
-        <w:t xml:space="preserve"> </w:t>
-      </w:r>
-      <w:r>
-        <w:rPr>
-          <w:spacing w:val="-4"/>
-          <w:sz w:val="20"/>
-        </w:rPr>
-        <w:t>forms and</w:t>
-      </w:r>
-      <w:r>
-        <w:rPr>
-          <w:spacing w:val="1"/>
-          <w:sz w:val="20"/>
-        </w:rPr>
-        <w:t xml:space="preserve"> </w:t>
-      </w:r>
-      <w:r>
-        <w:rPr>
-          <w:spacing w:val="-4"/>
-          <w:sz w:val="20"/>
-        </w:rPr>
-        <w:t>dashboards</w:t>
-      </w:r>
-      <w:r>
-        <w:rPr>
-          <w:spacing w:val="1"/>
-          <w:sz w:val="20"/>
-        </w:rPr>
-        <w:t xml:space="preserve"> </w:t>
-      </w:r>
-      <w:r>
-        <w:rPr>
-          <w:spacing w:val="-4"/>
-          <w:sz w:val="20"/>
-        </w:rPr>
-        <w:t>to</w:t>
-      </w:r>
-      <w:r>
-        <w:rPr>
-          <w:spacing w:val="-2"/>
-          <w:sz w:val="20"/>
-        </w:rPr>
-        <w:t xml:space="preserve"> </w:t>
-      </w:r>
-      <w:r>
-        <w:rPr>
-          <w:spacing w:val="-4"/>
-          <w:sz w:val="20"/>
-        </w:rPr>
-        <w:t>enhance</w:t>
-      </w:r>
-      <w:r>
-        <w:rPr>
-          <w:spacing w:val="1"/>
-          <w:sz w:val="20"/>
-        </w:rPr>
-        <w:t xml:space="preserve"> </w:t>
-      </w:r>
-      <w:r>
-        <w:rPr>
-          <w:spacing w:val="-4"/>
-          <w:sz w:val="20"/>
-        </w:rPr>
-        <w:t>user</w:t>
-      </w:r>
-      <w:r>
-        <w:rPr>
-          <w:spacing w:val="2"/>
-          <w:sz w:val="20"/>
-        </w:rPr>
-        <w:t xml:space="preserve"> </w:t>
-      </w:r>
-      <w:r>
-        <w:rPr>
-          <w:spacing w:val="-4"/>
-          <w:sz w:val="20"/>
-        </w:rPr>
-        <w:t>experience</w:t>
-      </w:r>
-      <w:r>
-        <w:rPr>
-          <w:spacing w:val="-4"/>
-          <w:sz w:val="20"/>
-        </w:rPr>
-        <w:t>.</w:t>
-      </w:r>
-    </w:p>
-    <w:p>
-      <w:pPr>
-        <w:pStyle w:val="ListParagraph"/>
-        <w:numPr>
-          <w:ilvl w:val="1"/>
-          <w:numId w:val="1"/>
-        </w:numPr>
-        <w:tabs>
-          <w:tab w:val="left" w:pos="348"/>
-        </w:tabs>
-        <w:spacing w:before="61"/>
-        <w:ind w:left="348" w:hanging="134"/>
-        <w:rPr>
-          <w:sz w:val="20"/>
-        </w:rPr>
-      </w:pPr>
-      <w:r>
-        <w:rPr>
-          <w:spacing w:val="-4"/>
-          <w:sz w:val="20"/>
-        </w:rPr>
-        <w:t>Focused on</w:t>
-      </w:r>
-      <w:r>
-        <w:rPr>
-          <w:spacing w:val="-2"/>
-          <w:sz w:val="20"/>
-        </w:rPr>
-        <w:t xml:space="preserve"> </w:t>
-      </w:r>
-      <w:r>
-        <w:rPr>
-          <w:spacing w:val="-4"/>
-          <w:sz w:val="20"/>
-        </w:rPr>
-        <w:t>responsive design</w:t>
-      </w:r>
-      <w:r>
-        <w:rPr>
-          <w:spacing w:val="-2"/>
-          <w:sz w:val="20"/>
-        </w:rPr>
-        <w:t xml:space="preserve"> </w:t>
-      </w:r>
-      <w:r>
-        <w:rPr>
-          <w:spacing w:val="-4"/>
-          <w:sz w:val="20"/>
-        </w:rPr>
-        <w:t>for seamless</w:t>
-      </w:r>
-      <w:r>
-        <w:rPr>
-          <w:spacing w:val="2"/>
-          <w:sz w:val="20"/>
-        </w:rPr>
-        <w:t xml:space="preserve"> </w:t>
-      </w:r>
-      <w:r>
-        <w:rPr>
-          <w:spacing w:val="-4"/>
-          <w:sz w:val="20"/>
-        </w:rPr>
-        <w:t>usage across</w:t>
-      </w:r>
-      <w:r>
-        <w:rPr>
-          <w:spacing w:val="2"/>
-          <w:sz w:val="20"/>
-        </w:rPr>
-        <w:t xml:space="preserve"> </w:t>
-      </w:r>
-      <w:r>
-        <w:rPr>
-          <w:spacing w:val="-4"/>
-          <w:sz w:val="20"/>
-        </w:rPr>
-        <w:t>devices</w:t>
-      </w:r>
-      <w:r>
-        <w:rPr>
-          <w:spacing w:val="-4"/>
-          <w:sz w:val="20"/>
-        </w:rPr>
-        <w:t>.</w:t>
       </w:r>
     </w:p>
     <w:tbl>
@@ -5097,7 +5033,6 @@
               <w:pStyle w:val="TableParagraph"/>
               <w:spacing w:line="215" w:lineRule="exact"/>
               <w:ind w:left="533"/>
-              <w:jc w:val="left"/>
               <w:rPr>
                 <w:rFonts w:ascii="Cambria"/>
                 <w:b/>
@@ -5279,7 +5214,6 @@
             <w:pPr>
               <w:pStyle w:val="TableParagraph"/>
               <w:ind w:left="331"/>
-              <w:jc w:val="left"/>
               <w:rPr>
                 <w:sz w:val="20"/>
               </w:rPr>
@@ -5653,6 +5587,7 @@
         </w:tabs>
         <w:spacing w:before="57"/>
         <w:ind w:left="84"/>
+        <w:jc w:val="both"/>
         <w:rPr>
           <w:rFonts w:ascii="Cambria"/>
           <w:b/>
@@ -5719,6 +5654,7 @@
           <w:tab w:val="left" w:pos="10639"/>
         </w:tabs>
         <w:spacing w:before="222"/>
+        <w:jc w:val="both"/>
         <w:rPr>
           <w:rFonts w:ascii="Cambria"/>
           <w:b/>
@@ -5789,6 +5725,7 @@
         </w:tabs>
         <w:spacing w:before="183"/>
         <w:ind w:hanging="230"/>
+        <w:jc w:val="both"/>
         <w:rPr>
           <w:i/>
           <w:sz w:val="18"/>
@@ -5890,6 +5827,7 @@
         </w:tabs>
         <w:spacing w:before="6"/>
         <w:ind w:hanging="230"/>
+        <w:jc w:val="both"/>
         <w:rPr>
           <w:i/>
           <w:sz w:val="18"/>
@@ -6019,6 +5957,7 @@
         </w:tabs>
         <w:spacing w:before="6"/>
         <w:ind w:hanging="230"/>
+        <w:jc w:val="both"/>
         <w:rPr>
           <w:i/>
           <w:sz w:val="18"/>
@@ -6730,6 +6669,7 @@
   <w:style w:type="paragraph" w:default="1" w:styleId="Normal">
     <w:name w:val="Normal"/>
     <w:qFormat/>
+    <w:rsid w:val="009F4F9F"/>
     <w:rPr>
       <w:rFonts w:ascii="Georgia" w:eastAsia="Georgia" w:hAnsi="Georgia" w:cs="Georgia"/>
     </w:rPr>
@@ -6737,6 +6677,7 @@
   <w:style w:type="paragraph" w:styleId="Heading1">
     <w:name w:val="heading 1"/>
     <w:basedOn w:val="Normal"/>
+    <w:link w:val="Heading1Char"/>
     <w:uiPriority w:val="9"/>
     <w:qFormat/>
     <w:pPr>
@@ -6854,6 +6795,21 @@
     <w:rPr>
       <w:color w:val="605E5C"/>
       <w:shd w:val="clear" w:color="auto" w:fill="E1DFDD"/>
+    </w:rPr>
+  </w:style>
+  <w:style w:type="character" w:customStyle="1" w:styleId="Heading1Char">
+    <w:name w:val="Heading 1 Char"/>
+    <w:basedOn w:val="DefaultParagraphFont"/>
+    <w:link w:val="Heading1"/>
+    <w:uiPriority w:val="9"/>
+    <w:rsid w:val="009F4F9F"/>
+    <w:rPr>
+      <w:rFonts w:ascii="Cambria" w:eastAsia="Cambria" w:hAnsi="Cambria" w:cs="Cambria"/>
+      <w:b/>
+      <w:bCs/>
+      <w:sz w:val="20"/>
+      <w:szCs w:val="20"/>
+      <w:u w:val="single" w:color="000000"/>
     </w:rPr>
   </w:style>
 </w:styles>

</xml_diff>